<commit_message>
docx: regenerate playbook 17 mirror
</commit_message>
<xml_diff>
--- a/02_Specifications/17_SEO_and_AI_Discoverability_Playbook.docx
+++ b/02_Specifications/17_SEO_and_AI_Discoverability_Playbook.docx
@@ -10279,6 +10279,247 @@
         </w:tc>
       </w:tr>
     </w:tbl>
+    <w:p>
+      <w:pPr>
+        <w:pStyle w:val="BlockText"/>
+      </w:pPr>
+      <w:r>
+        <w:rPr>
+          <w:b/>
+          <w:bCs/>
+        </w:rPr>
+        <w:t xml:space="preserve">2026-09-27 — templates 5–7 SHIPPED, with an EVENT level added (owner).</w:t>
+      </w:r>
+      <w:r>
+        <w:t xml:space="preserve"> </w:t>
+      </w:r>
+      <w:r>
+        <w:t xml:space="preserve">People search</w:t>
+      </w:r>
+      <w:r>
+        <w:t xml:space="preserve"> </w:t>
+      </w:r>
+      <w:r>
+        <w:rPr>
+          <w:i/>
+          <w:iCs/>
+        </w:rPr>
+        <w:t xml:space="preserve">“debut package</w:t>
+      </w:r>
+      <w:r>
+        <w:rPr>
+          <w:i/>
+          <w:iCs/>
+        </w:rPr>
+        <w:t xml:space="preserve"> </w:t>
+      </w:r>
+      <w:r>
+        <w:rPr>
+          <w:i/>
+          <w:iCs/>
+        </w:rPr>
+        <w:t xml:space="preserve">Quezon City”</w:t>
+      </w:r>
+      <w:r>
+        <w:t xml:space="preserve">, not</w:t>
+      </w:r>
+      <w:r>
+        <w:t xml:space="preserve"> </w:t>
+      </w:r>
+      <w:r>
+        <w:rPr>
+          <w:i/>
+          <w:iCs/>
+        </w:rPr>
+        <w:t xml:space="preserve">“package Quezon City”</w:t>
+      </w:r>
+      <w:r>
+        <w:t xml:space="preserve">, so the built shape is</w:t>
+      </w:r>
+      <w:r>
+        <w:t xml:space="preserve"> </w:t>
+      </w:r>
+      <w:r>
+        <w:rPr>
+          <w:rStyle w:val="VerbatimChar"/>
+        </w:rPr>
+        <w:t xml:space="preserve">/suppliers</w:t>
+      </w:r>
+      <w:r>
+        <w:t xml:space="preserve"> </w:t>
+      </w:r>
+      <w:r>
+        <w:t xml:space="preserve">·</w:t>
+      </w:r>
+      <w:r>
+        <w:t xml:space="preserve"> </w:t>
+      </w:r>
+      <w:r>
+        <w:rPr>
+          <w:rStyle w:val="VerbatimChar"/>
+        </w:rPr>
+        <w:t xml:space="preserve">/suppliers/[event]/[category]</w:t>
+      </w:r>
+      <w:r>
+        <w:t xml:space="preserve"> </w:t>
+      </w:r>
+      <w:r>
+        <w:t xml:space="preserve">·</w:t>
+      </w:r>
+      <w:r>
+        <w:t xml:space="preserve"> </w:t>
+      </w:r>
+      <w:r>
+        <w:rPr>
+          <w:rStyle w:val="VerbatimChar"/>
+        </w:rPr>
+        <w:t xml:space="preserve">/suppliers/[event]/[category]/[city]</w:t>
+      </w:r>
+      <w:r>
+        <w:t xml:space="preserve"> </w:t>
+      </w:r>
+      <w:r>
+        <w:t xml:space="preserve">(e.g.</w:t>
+      </w:r>
+      <w:r>
+        <w:t xml:space="preserve"> </w:t>
+      </w:r>
+      <w:r>
+        <w:rPr>
+          <w:rStyle w:val="VerbatimChar"/>
+        </w:rPr>
+        <w:t xml:space="preserve">/suppliers/debut/coordinator/quezon-city</w:t>
+      </w:r>
+      <w:r>
+        <w:t xml:space="preserve">), built from suppliers’</w:t>
+      </w:r>
+      <w:r>
+        <w:t xml:space="preserve"> </w:t>
+      </w:r>
+      <w:r>
+        <w:rPr>
+          <w:b/>
+          <w:bCs/>
+        </w:rPr>
+        <w:t xml:space="preserve">service cards</w:t>
+      </w:r>
+      <w:r>
+        <w:t xml:space="preserve"> </w:t>
+      </w:r>
+      <w:r>
+        <w:t xml:space="preserve">with their own published</w:t>
+      </w:r>
+      <w:r>
+        <w:t xml:space="preserve"> </w:t>
+      </w:r>
+      <w:r>
+        <w:t xml:space="preserve">prices.</w:t>
+      </w:r>
+      <w:r>
+        <w:t xml:space="preserve"> </w:t>
+      </w:r>
+      <w:r>
+        <w:rPr>
+          <w:b/>
+          <w:bCs/>
+        </w:rPr>
+        <w:t xml:space="preserve">Gate:</w:t>
+      </w:r>
+      <w:r>
+        <w:t xml:space="preserve"> </w:t>
+      </w:r>
+      <w:r>
+        <w:t xml:space="preserve">a page is</w:t>
+      </w:r>
+      <w:r>
+        <w:t xml:space="preserve"> </w:t>
+      </w:r>
+      <w:r>
+        <w:rPr>
+          <w:rStyle w:val="VerbatimChar"/>
+        </w:rPr>
+        <w:t xml:space="preserve">index</w:t>
+      </w:r>
+      <w:r>
+        <w:t xml:space="preserve"> </w:t>
+      </w:r>
+      <w:r>
+        <w:t xml:space="preserve">only with ≥3 cards from ≥2 verified non-demo shops (</w:t>
+      </w:r>
+      <w:r>
+        <w:rPr>
+          <w:rStyle w:val="VerbatimChar"/>
+        </w:rPr>
+        <w:t xml:space="preserve">lib/supplier-landing.ts</w:t>
+      </w:r>
+      <w:r>
+        <w:t xml:space="preserve"> </w:t>
+      </w:r>
+      <w:r>
+        <w:rPr>
+          <w:rStyle w:val="VerbatimChar"/>
+        </w:rPr>
+        <w:t xml:space="preserve">SUPPLIER_PAGE_MIN_*</w:t>
+      </w:r>
+      <w:r>
+        <w:t xml:space="preserve">); below it the page renders for people but is</w:t>
+      </w:r>
+      <w:r>
+        <w:t xml:space="preserve"> </w:t>
+      </w:r>
+      <w:r>
+        <w:rPr>
+          <w:rStyle w:val="VerbatimChar"/>
+        </w:rPr>
+        <w:t xml:space="preserve">noindex</w:t>
+      </w:r>
+      <w:r>
+        <w:t xml:space="preserve"> </w:t>
+      </w:r>
+      <w:r>
+        <w:t xml:space="preserve">and left out of</w:t>
+      </w:r>
+      <w:r>
+        <w:t xml:space="preserve"> </w:t>
+      </w:r>
+      <w:r>
+        <w:rPr>
+          <w:rStyle w:val="VerbatimChar"/>
+        </w:rPr>
+        <w:t xml:space="preserve">/sitemap-suppliers.xml</w:t>
+      </w:r>
+      <w:r>
+        <w:t xml:space="preserve">. ⚠</w:t>
+      </w:r>
+      <w:r>
+        <w:t xml:space="preserve"> </w:t>
+      </w:r>
+      <w:r>
+        <w:rPr>
+          <w:b/>
+          <w:bCs/>
+        </w:rPr>
+        <w:t xml:space="preserve">Content depth is BELOW this table’s 400/600/800-word minimums</w:t>
+      </w:r>
+      <w:r>
+        <w:t xml:space="preserve"> </w:t>
+      </w:r>
+      <w:r>
+        <w:t xml:space="preserve">— the pages carry a</w:t>
+      </w:r>
+      <w:r>
+        <w:t xml:space="preserve"> </w:t>
+      </w:r>
+      <w:r>
+        <w:t xml:space="preserve">live data summary, the card grid and a 3-question FAQ, not long-form prose. Per-category guide copy is the</w:t>
+      </w:r>
+      <w:r>
+        <w:t xml:space="preserve"> </w:t>
+      </w:r>
+      <w:r>
+        <w:t xml:space="preserve">open follow-up; the gate is what keeps thin pages out of the index meanwhile.</w:t>
+      </w:r>
+    </w:p>
     <w:bookmarkEnd w:id="30"/>
     <w:bookmarkStart w:id="31" w:name="title-meta-patterns-per-template"/>
     <w:p>
@@ -19732,7 +19973,7 @@
         <w:rPr>
           <w:rStyle w:val="AttributeTok"/>
         </w:rPr>
-        <w:t xml:space="preserve">&gt; Setnayan (SET-na-yan, from Tagalog "Set na 'yan." — "that's all set") is a Philippines-first life-events platform. V1 surface is weddings, designed to extend to birthdays, travel, corporate, and burial events. Free for couples and guests; free verified business profiles for vendors during launch. Transparent PHP pricing, apply-then-pay model, locally-rooted Filipino voice with EN / TL / CEB localization on the marketing site.</w:t>
+        <w:t xml:space="preserve">&gt; Setnayan (SET-na-yan, from Tagalog "Set na 'yan." — "that's all set") is a Philippines-first life-events platform. V1 surface is weddings, designed to extend to birthdays, debuts, christenings, corporate, and more celebrations. Free for couples and guests; free verified business profiles for vendors during launch. Transparent PHP pricing, apply-then-pay model, locally-rooted Filipino voice with EN / TL / CEB localization on the marketing site.</w:t>
       </w:r>
       <w:r>
         <w:br/>

</xml_diff>